<commit_message>
Expand methodology notebook with explicit preprocessing, CRNN, and training-loop stages.
Examiners can now run the actual prepare_line / build_crnn / CTC loop cells instead of a high-level pipeline table.

Co-authored-by: Cursor <cursoragent@cursor.com>
</commit_message>
<xml_diff>
--- a/docs/Methodology.docx
+++ b/docs/Methodology.docx
@@ -44,7 +44,7 @@
         <w:t>Companion notebook:</w:t>
       </w:r>
       <w:r>
-        <w:t xml:space="preserve"> `notebooks/training_methodology.ipynb`</w:t>
+        <w:t xml:space="preserve"> `notebooks/training_methodology.ipynb` (preprocessing, CRNN `print(model)`, CTC training loop)</w:t>
       </w:r>
     </w:p>
     <w:p>
@@ -212,7 +212,12 @@
     </w:p>
     <w:p>
       <w:r>
-        <w:t>so what is measured is what a user upload goes through.</w:t>
+        <w:t>so what is measured is what a user upload goes through. Runnable walkthrough of</w:t>
+      </w:r>
+    </w:p>
+    <w:p>
+      <w:r>
+        <w:t>the same stages: `notebooks/training_methodology.ipynb` §§4–7.</w:t>
       </w:r>
     </w:p>
     <w:p>
@@ -223,7 +228,9 @@
         </w:rPr>
         <w:t>(1) Acquisition     (2) Preprocess      (3) Detection       (4) Recognition      (5) Post-process</w:t>
         <w:br/>
-        <w:t xml:space="preserve"> phone / scanner  →  deskew / CLAHE  →  projection lines →  CRNN + CTC decode →  matra / lyric rules</w:t>
+        <w:t xml:space="preserve"> phone / scanner  →  deskew / invert  →  projection lines →  CRNN + CTC decode →  matra / lyric rules</w:t>
+        <w:br/>
+        <w:t xml:space="preserve">                    + resize H=48</w:t>
       </w:r>
     </w:p>
     <w:tbl>
@@ -295,7 +302,7 @@
           </w:tcPr>
           <w:p>
             <w:r>
-              <w:t>`src/preprocessing/`, deskew in `src/detection/text_detection.py`</w:t>
+              <w:t>Deskew in `src/detection/text_detection.py`; line prep in `src/recognition/inference.py`</w:t>
             </w:r>
           </w:p>
         </w:tc>
@@ -305,7 +312,7 @@
           </w:tcPr>
           <w:p>
             <w:r>
-              <w:t>A few degrees of skew merge adjacent projection bands on photographed columns. Deskew (`detection.deskew: true`, search ±5°) is applied before the ink profile.</w:t>
+              <w:t>A few degrees of skew merge adjacent projection bands. Short crops are *upscaled* to 48 px so training and inference share `resize_keep_height`.</w:t>
             </w:r>
           </w:p>
         </w:tc>
@@ -327,7 +334,7 @@
           </w:tcPr>
           <w:p>
             <w:r>
-              <w:t>Horizontal projection on a contrast-binarised ink mask; tall-band re-split at the internal valley</w:t>
+              <w:t>`ProjectionLineDetector`: contrast-binarised ink mask, border/watermark suppression, tall-band re-split</w:t>
             </w:r>
           </w:p>
         </w:tc>
@@ -337,7 +344,7 @@
           </w:tcPr>
           <w:p>
             <w:r>
-              <w:t>Classical, inspectable, and exact on the evaluation suite (76/76, 9/9, 23/23 lines). Watermark/border suppression avoids treating ornaments as text.</w:t>
+              <w:t>Classical, inspectable, exact on the evaluation suite (76/76, 9/9, 23/23 lines).</w:t>
             </w:r>
           </w:p>
         </w:tc>
@@ -359,7 +366,7 @@
           </w:tcPr>
           <w:p>
             <w:r>
-              <w:t>CRNN (CNN → BiLSTM → linear) trained with CTC</w:t>
+              <w:t>CRNN in `src/recognition/model.py` (CNN → AdaptiveAvgPool → BiLSTM → linear), CTC</w:t>
             </w:r>
           </w:p>
         </w:tc>
@@ -369,7 +376,7 @@
           </w:tcPr>
           <w:p>
             <w:r>
-              <w:t>No character boxes required; fits a single RTX 4060-class GPU. Input height 48 px, variable width (max 512).</w:t>
+              <w:t>No character boxes; fits a single RTX 4060-class GPU. Input `(B, 1, 48, W)`, output `(T, B, 225)`.</w:t>
             </w:r>
           </w:p>
         </w:tc>
@@ -391,7 +398,7 @@
           </w:tcPr>
           <w:p>
             <w:r>
-              <w:t>CTC prefix beam search with 6-gram character-LM shallow fusion</w:t>
+              <w:t>CTC greedy, prefix beam, or beam + 6-gram character-LM (`src/recognition/decode.py`)</w:t>
             </w:r>
           </w:p>
         </w:tc>
@@ -441,8 +448,424 @@
     </w:tbl>
     <w:p/>
     <w:p>
-      <w:r>
-        <w:t xml:space="preserve">Short crops at inference are </w:t>
+      <w:pPr>
+        <w:pStyle w:val="Heading2"/>
+      </w:pPr>
+      <w:r>
+        <w:t>2.1 Page-level preprocessing (deskew)</w:t>
+      </w:r>
+    </w:p>
+    <w:p>
+      <w:r>
+        <w:t xml:space="preserve">The delivered detector deskew is </w:t>
+      </w:r>
+      <w:r>
+        <w:rPr>
+          <w:b/>
+        </w:rPr>
+        <w:t>not</w:t>
+      </w:r>
+      <w:r>
+        <w:t xml:space="preserve"> the min-area-rect helper in</w:t>
+      </w:r>
+    </w:p>
+    <w:p>
+      <w:r>
+        <w:t>`src/preprocessing/preprocess.py`. Evaluation (`run_pipeline_on_gray`) estimates</w:t>
+      </w:r>
+    </w:p>
+    <w:p>
+      <w:r>
+        <w:t>skew from the ink mask and rotates the page *before* projection:</w:t>
+      </w:r>
+    </w:p>
+    <w:p>
+      <w:pPr>
+        <w:pStyle w:val="ListNumber"/>
+      </w:pPr>
+      <w:r>
+        <w:t>Convert the page to grayscale.</w:t>
+      </w:r>
+    </w:p>
+    <w:p>
+      <w:pPr>
+        <w:pStyle w:val="ListNumber"/>
+      </w:pPr>
+      <w:r>
+        <w:t>Build an ink mask (`detector.ink_mask` → `binarize_for_detection`).</w:t>
+      </w:r>
+    </w:p>
+    <w:p>
+      <w:pPr>
+        <w:pStyle w:val="ListNumber"/>
+      </w:pPr>
+      <w:r>
+        <w:t>`estimate_page_skew(mask, max_angle=5.0)`: search \(\theta \in [-5^\circ,+5^\circ]\)</w:t>
+      </w:r>
+    </w:p>
+    <w:p>
+      <w:r>
+        <w:t>(coarse \(0.5^\circ\), then fine \(0.1^\circ\)) maximising the sharpness of the</w:t>
+      </w:r>
+    </w:p>
+    <w:p>
+      <w:r>
+        <w:t>horizontal ink profile</w:t>
+      </w:r>
+    </w:p>
+    <w:p>
+      <w:r>
+        <w:t>\[</w:t>
+      </w:r>
+    </w:p>
+    <w:p>
+      <w:r>
+        <w:t>S(\theta)=\sum_y\left(\sum_x M_\theta(x,y)\right)^2.</w:t>
+      </w:r>
+    </w:p>
+    <w:p>
+      <w:r>
+        <w:t>\]</w:t>
+      </w:r>
+    </w:p>
+    <w:p>
+      <w:pPr>
+        <w:pStyle w:val="ListNumber"/>
+      </w:pPr>
+      <w:r>
+        <w:t>Apply `rotate_page` only when \(S(\theta^\star)\ge 1.02\,S(0)\) and</w:t>
+      </w:r>
+    </w:p>
+    <w:p>
+      <w:r>
+        <w:t>\(|\theta^\star|\ge 0.3^\circ\) (`detection.deskew_min_angle`). Corners are</w:t>
+      </w:r>
+    </w:p>
+    <w:p>
+      <w:r>
+        <w:t>filled with the page-border median so they are not binarised as fake ink.</w:t>
+      </w:r>
+    </w:p>
+    <w:p>
+      <w:r>
+        <w:t>`src/preprocessing/preprocess.py` still exposes CLAHE / denoise / Otsu for</w:t>
+      </w:r>
+    </w:p>
+    <w:p>
+      <w:r>
+        <w:t xml:space="preserve">optional document cleaning; the scored path does </w:t>
+      </w:r>
+      <w:r>
+        <w:rPr>
+          <w:b/>
+        </w:rPr>
+        <w:t>not</w:t>
+      </w:r>
+      <w:r>
+        <w:t xml:space="preserve"> binarise the page</w:t>
+      </w:r>
+    </w:p>
+    <w:p>
+      <w:r>
+        <w:t>before recognition (binarisation is detection-only).</w:t>
+      </w:r>
+    </w:p>
+    <w:p>
+      <w:pPr>
+        <w:pStyle w:val="Heading2"/>
+      </w:pPr>
+      <w:r>
+        <w:t>2.2 Detection (`ProjectionLineDetector`)</w:t>
+      </w:r>
+    </w:p>
+    <w:p>
+      <w:r>
+        <w:t>Config (`configs/local.yaml` `detection:`): `method: projection`,</w:t>
+      </w:r>
+    </w:p>
+    <w:p>
+      <w:r>
+        <w:t>`min_contrast: 25`, `suppress_borders: true`, `min_ink_frac: 0.004`,</w:t>
+      </w:r>
+    </w:p>
+    <w:p>
+      <w:r>
+        <w:t>`min_ink_density: 0.01`, `min_height_frac: 0.35`, crop padding \(10\times5\) px,</w:t>
+      </w:r>
+    </w:p>
+    <w:p>
+      <w:r>
+        <w:t>`min_crop_height: 14`.</w:t>
+      </w:r>
+    </w:p>
+    <w:p>
+      <w:pPr>
+        <w:pStyle w:val="ListNumber"/>
+      </w:pPr>
+      <w:r/>
+      <w:r>
+        <w:rPr>
+          <w:b/>
+        </w:rPr>
+        <w:t>Binarise.</w:t>
+      </w:r>
+      <w:r>
+        <w:t xml:space="preserve"> Local background = large median blur; darkness relative to</w:t>
+      </w:r>
+    </w:p>
+    <w:p>
+      <w:r>
+        <w:t>background; Otsu threshold floored at `min_contrast` (drops faint watermarks).</w:t>
+      </w:r>
+    </w:p>
+    <w:p>
+      <w:r>
+        <w:t>Ink is 255 on 0.</w:t>
+      </w:r>
+    </w:p>
+    <w:p>
+      <w:pPr>
+        <w:pStyle w:val="ListNumber"/>
+      </w:pPr>
+      <w:r/>
+      <w:r>
+        <w:rPr>
+          <w:b/>
+        </w:rPr>
+        <w:t>Suppress borders.</w:t>
+      </w:r>
+      <w:r>
+        <w:t xml:space="preserve"> Connected components that span most of the page, or</w:t>
+      </w:r>
+    </w:p>
+    <w:p>
+      <w:r>
+        <w:t>that touch the margin band and are long-and-thin, are erased.</w:t>
+      </w:r>
+    </w:p>
+    <w:p>
+      <w:pPr>
+        <w:pStyle w:val="ListNumber"/>
+      </w:pPr>
+      <w:r/>
+      <w:r>
+        <w:rPr>
+          <w:b/>
+        </w:rPr>
+        <w:t>Horizontal projection.</w:t>
+      </w:r>
+      <w:r>
+        <w:t xml:space="preserve"> Rows with ink fraction \(\ge\) `min_ink_frac` form</w:t>
+      </w:r>
+    </w:p>
+    <w:p>
+      <w:r>
+        <w:t>bands. Neighbouring bands merge only when the gap is small *and* one side is</w:t>
+      </w:r>
+    </w:p>
+    <w:p>
+      <w:r>
+        <w:t>a diacritic fragment. Bands taller than \(1.2\times\) the median height are</w:t>
+      </w:r>
+    </w:p>
+    <w:p>
+      <w:r>
+        <w:t>re-split at an internal profile valley (`_split_tall_band`).</w:t>
+      </w:r>
+    </w:p>
+    <w:p>
+      <w:pPr>
+        <w:pStyle w:val="ListNumber"/>
+      </w:pPr>
+      <w:r/>
+      <w:r>
+        <w:rPr>
+          <w:b/>
+        </w:rPr>
+        <w:t>Boxes.</w:t>
+      </w:r>
+      <w:r>
+        <w:t xml:space="preserve"> Each band becomes an axis-aligned box hugging the ink extent</w:t>
+      </w:r>
+    </w:p>
+    <w:p>
+      <w:r>
+        <w:t>(`band_to_box`), then relative-height filtering. Reading order: top-to-bottom.</w:t>
+      </w:r>
+    </w:p>
+    <w:p>
+      <w:pPr>
+        <w:pStyle w:val="ListNumber"/>
+      </w:pPr>
+      <w:r/>
+      <w:r>
+        <w:rPr>
+          <w:b/>
+        </w:rPr>
+        <w:t>Crops.</w:t>
+      </w:r>
+      <w:r>
+        <w:t xml:space="preserve"> `crop_lines` adds padding and enforces `min_crop_height`.</w:t>
+      </w:r>
+    </w:p>
+    <w:p>
+      <w:r>
+        <w:t>`OpenCVLineDetector` (morphology + contours) is a config fallback, not the</w:t>
+      </w:r>
+    </w:p>
+    <w:p>
+      <w:r>
+        <w:t>delivered method. `DBNetDetector` is an unimplemented placeholder.</w:t>
+      </w:r>
+    </w:p>
+    <w:p>
+      <w:pPr>
+        <w:pStyle w:val="Heading2"/>
+      </w:pPr>
+      <w:r>
+        <w:t>2.3 Line-crop recognition preprocessing</w:t>
+      </w:r>
+    </w:p>
+    <w:p>
+      <w:r>
+        <w:t>Each crop is prepared by `prepare_line_for_recognition` /</w:t>
+      </w:r>
+    </w:p>
+    <w:p>
+      <w:r>
+        <w:t>`prepare_line_tensor` (`src/recognition/inference.py`). Training</w:t>
+      </w:r>
+    </w:p>
+    <w:p>
+      <w:r>
+        <w:t>(`OCRLineDataset`) uses the same height, width cap and normalisation.</w:t>
+      </w:r>
+    </w:p>
+    <w:p>
+      <w:pPr>
+        <w:pStyle w:val="ListNumber"/>
+      </w:pPr>
+      <w:r>
+        <w:t>uint8 grayscale.</w:t>
+      </w:r>
+    </w:p>
+    <w:p>
+      <w:pPr>
+        <w:pStyle w:val="ListNumber"/>
+      </w:pPr>
+      <w:r>
+        <w:t>Optional median denoise (off: `inference.denoise: false`).</w:t>
+      </w:r>
+    </w:p>
+    <w:p>
+      <w:pPr>
+        <w:pStyle w:val="ListNumber"/>
+      </w:pPr>
+      <w:r>
+        <w:t>Polarity: invert if `auto_invert` and mean intensity \(&lt; 128\) (light-on-dark</w:t>
+      </w:r>
+    </w:p>
+    <w:p>
+      <w:r>
+        <w:t>titles become dark-on-light).</w:t>
+      </w:r>
+    </w:p>
+    <w:p>
+      <w:pPr>
+        <w:pStyle w:val="ListNumber"/>
+      </w:pPr>
+      <w:r>
+        <w:t>Height policy (`inference.pad_to_height`):</w:t>
+      </w:r>
+    </w:p>
+    <w:p>
+      <w:r>
+        <w:t>* `true` — white-pad a short crop to 48 px; glyphs stay at the original</w:t>
+      </w:r>
+    </w:p>
+    <w:p>
+      <w:r>
+        <w:t>height inside the canvas.</w:t>
+      </w:r>
+    </w:p>
+    <w:p>
+      <w:r>
+        <w:t>* `false` (</w:t>
+      </w:r>
+      <w:r>
+        <w:rPr>
+          <w:b/>
+        </w:rPr>
+        <w:t>delivered</w:t>
+      </w:r>
+      <w:r>
+        <w:t>) — skip padding; `resize_keep_height` *upscales*</w:t>
+      </w:r>
+    </w:p>
+    <w:p>
+      <w:r>
+        <w:t>so glyphs fill 48 px.</w:t>
+      </w:r>
+    </w:p>
+    <w:p>
+      <w:pPr>
+        <w:pStyle w:val="ListNumber"/>
+      </w:pPr>
+      <w:r>
+        <w:t>Resize keeping aspect ratio, clamp width at 512:</w:t>
+      </w:r>
+    </w:p>
+    <w:p>
+      <w:r>
+        <w:t>\[</w:t>
+      </w:r>
+    </w:p>
+    <w:p>
+      <w:r>
+        <w:t>w'=\min\bigl(512,\; \mathrm{round}(w\cdot 48/h)\bigr).</w:t>
+      </w:r>
+    </w:p>
+    <w:p>
+      <w:r>
+        <w:t>\]</w:t>
+      </w:r>
+    </w:p>
+    <w:p>
+      <w:pPr>
+        <w:pStyle w:val="ListNumber"/>
+      </w:pPr>
+      <w:r>
+        <w:t>Tensor \(x\in\mathbb{R}^{1\times 48\times w'}\):</w:t>
+      </w:r>
+    </w:p>
+    <w:p>
+      <w:r>
+        <w:t>\[</w:t>
+      </w:r>
+    </w:p>
+    <w:p>
+      <w:r>
+        <w:t>x \leftarrow x/255,\qquad x \leftarrow (x-0.5)/0.5</w:t>
+      </w:r>
+    </w:p>
+    <w:p>
+      <w:r>
+        <w:t>\]</w:t>
+      </w:r>
+    </w:p>
+    <w:p>
+      <w:r>
+        <w:t>so pixels lie in roughly \([-1,1]\). White (\(255\)) becomes \(+1\), which is</w:t>
+      </w:r>
+    </w:p>
+    <w:p>
+      <w:r>
+        <w:t>also the collate pad value.</w:t>
+      </w:r>
+    </w:p>
+    <w:p>
+      <w:r>
+        <w:t xml:space="preserve">Short crops at inference are therefore </w:t>
       </w:r>
       <w:r>
         <w:rPr>
@@ -451,22 +874,17 @@
         <w:t>upscaled</w:t>
       </w:r>
       <w:r>
-        <w:t xml:space="preserve"> to 48 px (`pad_to_height: false`).</w:t>
+        <w:t xml:space="preserve"> to 48 px. White-padding an</w:t>
       </w:r>
     </w:p>
     <w:p>
       <w:r>
-        <w:t>Training always resizes with `resize_keep_height`. White-padding a 18 px lyric</w:t>
+        <w:t>~18 px lyric line used to leave glyphs at 18 px inside a 48 px canvas — a</w:t>
       </w:r>
     </w:p>
     <w:p>
       <w:r>
-        <w:t>line used to leave glyphs at 18 px inside a 48 px canvas — a train/inference</w:t>
-      </w:r>
-    </w:p>
-    <w:p>
-      <w:r>
-        <w:t>mismatch that was measured and then removed (`RESULTS.md` §3a).</w:t>
+        <w:t>train/inference mismatch that was measured and then removed (`RESULTS.md` §3a).</w:t>
       </w:r>
     </w:p>
     <w:p/>
@@ -1475,12 +1893,343 @@
     </w:p>
     <w:p>
       <w:r>
-        <w:t>*IEEE TPAMI* 2017): CNN backbone → map-to-sequence → two Bidirectional LSTM</w:t>
+        <w:t>*IEEE TPAMI* 2017). Implementation is exactly `src/recognition/model.py`: a CNN</w:t>
       </w:r>
     </w:p>
     <w:p>
       <w:r>
-        <w:t>blocks → linear layer over classes. Implementation: `src/recognition/model.py`.</w:t>
+        <w:t>backbone, `AdaptiveAvgPool2d((1, None))` if feature height is not already 1, a</w:t>
+      </w:r>
+    </w:p>
+    <w:p>
+      <w:r>
+        <w:t>map-to-sequence permute, two `BidirectionalLSTM` blocks, and a linear CTC head.</w:t>
+      </w:r>
+    </w:p>
+    <w:p>
+      <w:r>
+        <w:t xml:space="preserve">`forward` returns log-probabilities of shape </w:t>
+      </w:r>
+      <w:r>
+        <w:rPr>
+          <w:b/>
+        </w:rPr>
+        <w:t>`(T, B, num_classes)`</w:t>
+      </w:r>
+      <w:r>
+        <w:t>.</w:t>
+      </w:r>
+    </w:p>
+    <w:p>
+      <w:r>
+        <w:rPr>
+          <w:rFonts w:ascii="Consolas" w:hAnsi="Consolas"/>
+          <w:sz w:val="18"/>
+        </w:rPr>
+        <w:t>flowchart LR</w:t>
+        <w:br/>
+        <w:t xml:space="preserve">  A["input (B, 1, 48, W)"] --&gt; B[CNN]</w:t>
+        <w:br/>
+        <w:t xml:space="preserve">  B --&gt; C["AdaptiveAvgPool height=1"]</w:t>
+        <w:br/>
+        <w:t xml:space="preserve">  C --&gt; D["permute (T, B, C')"]</w:t>
+        <w:br/>
+        <w:t xml:space="preserve">  D --&gt; E["BiLSTM 1: LSTM 512→256 x2 layers + Linear 512→256"]</w:t>
+        <w:br/>
+        <w:t xml:space="preserve">  E --&gt; F["BiLSTM 2: LSTM 256→256 x1 layer + Linear 512→225"]</w:t>
+        <w:br/>
+        <w:t xml:space="preserve">  F --&gt; G["log-softmax (T, B, 225)"]</w:t>
+      </w:r>
+    </w:p>
+    <w:p>
+      <w:r/>
+      <w:r>
+        <w:rPr>
+          <w:b/>
+        </w:rPr>
+        <w:t>CNN layers</w:t>
+      </w:r>
+      <w:r>
+        <w:t xml:space="preserve"> (no layers are invented beyond `CRNN.cnn`):</w:t>
+      </w:r>
+    </w:p>
+    <w:tbl>
+      <w:tblPr>
+        <w:tblStyle w:val="TableGrid"/>
+        <w:tblW w:type="auto" w:w="0"/>
+        <w:tblLook w:firstColumn="1" w:firstRow="1" w:lastColumn="0" w:lastRow="0" w:noHBand="0" w:noVBand="1" w:val="04A0"/>
+      </w:tblPr>
+      <w:tblGrid>
+        <w:gridCol w:w="2880"/>
+        <w:gridCol w:w="2880"/>
+        <w:gridCol w:w="2880"/>
+      </w:tblGrid>
+      <w:tr>
+        <w:tc>
+          <w:tcPr>
+            <w:tcW w:type="dxa" w:w="2880"/>
+          </w:tcPr>
+          <w:p>
+            <w:r>
+              <w:rPr>
+                <w:b/>
+              </w:rPr>
+              <w:t>Block</w:t>
+            </w:r>
+          </w:p>
+        </w:tc>
+        <w:tc>
+          <w:tcPr>
+            <w:tcW w:type="dxa" w:w="2880"/>
+          </w:tcPr>
+          <w:p>
+            <w:r>
+              <w:rPr>
+                <w:b/>
+              </w:rPr>
+              <w:t>Layers in `model.py`</w:t>
+            </w:r>
+          </w:p>
+        </w:tc>
+        <w:tc>
+          <w:tcPr>
+            <w:tcW w:type="dxa" w:w="2880"/>
+          </w:tcPr>
+          <w:p>
+            <w:r>
+              <w:rPr>
+                <w:b/>
+              </w:rPr>
+              <w:t>Spatial note (H=48)</w:t>
+            </w:r>
+          </w:p>
+        </w:tc>
+      </w:tr>
+      <w:tr>
+        <w:tc>
+          <w:tcPr>
+            <w:tcW w:type="dxa" w:w="2880"/>
+          </w:tcPr>
+          <w:p>
+            <w:r>
+              <w:t>1</w:t>
+            </w:r>
+          </w:p>
+        </w:tc>
+        <w:tc>
+          <w:tcPr>
+            <w:tcW w:type="dxa" w:w="2880"/>
+          </w:tcPr>
+          <w:p>
+            <w:r>
+              <w:t>Conv 3×3, 1→64, ReLU; MaxPool 2×2</w:t>
+            </w:r>
+          </w:p>
+        </w:tc>
+        <w:tc>
+          <w:tcPr>
+            <w:tcW w:type="dxa" w:w="2880"/>
+          </w:tcPr>
+          <w:p>
+            <w:r>
+              <w:t>H/2, W/2</w:t>
+            </w:r>
+          </w:p>
+        </w:tc>
+      </w:tr>
+      <w:tr>
+        <w:tc>
+          <w:tcPr>
+            <w:tcW w:type="dxa" w:w="2880"/>
+          </w:tcPr>
+          <w:p>
+            <w:r>
+              <w:t>2</w:t>
+            </w:r>
+          </w:p>
+        </w:tc>
+        <w:tc>
+          <w:tcPr>
+            <w:tcW w:type="dxa" w:w="2880"/>
+          </w:tcPr>
+          <w:p>
+            <w:r>
+              <w:t>Conv 3×3, 64→128, ReLU; MaxPool 2×2</w:t>
+            </w:r>
+          </w:p>
+        </w:tc>
+        <w:tc>
+          <w:tcPr>
+            <w:tcW w:type="dxa" w:w="2880"/>
+          </w:tcPr>
+          <w:p>
+            <w:r>
+              <w:t>H/4, W/4</w:t>
+            </w:r>
+          </w:p>
+        </w:tc>
+      </w:tr>
+      <w:tr>
+        <w:tc>
+          <w:tcPr>
+            <w:tcW w:type="dxa" w:w="2880"/>
+          </w:tcPr>
+          <w:p>
+            <w:r>
+              <w:t>3</w:t>
+            </w:r>
+          </w:p>
+        </w:tc>
+        <w:tc>
+          <w:tcPr>
+            <w:tcW w:type="dxa" w:w="2880"/>
+          </w:tcPr>
+          <w:p>
+            <w:r>
+              <w:t>Conv 3×3, 128→256, ReLU; Conv 3×3, 256→256, ReLU; MaxPool (2,2) stride (2,1) pad (0,1)</w:t>
+            </w:r>
+          </w:p>
+        </w:tc>
+        <w:tc>
+          <w:tcPr>
+            <w:tcW w:type="dxa" w:w="2880"/>
+          </w:tcPr>
+          <w:p>
+            <w:r>
+              <w:t>H/8, W/4</w:t>
+            </w:r>
+          </w:p>
+        </w:tc>
+      </w:tr>
+      <w:tr>
+        <w:tc>
+          <w:tcPr>
+            <w:tcW w:type="dxa" w:w="2880"/>
+          </w:tcPr>
+          <w:p>
+            <w:r>
+              <w:t>4</w:t>
+            </w:r>
+          </w:p>
+        </w:tc>
+        <w:tc>
+          <w:tcPr>
+            <w:tcW w:type="dxa" w:w="2880"/>
+          </w:tcPr>
+          <w:p>
+            <w:r>
+              <w:t>Conv 3×3, 256→512, **BN**, ReLU; Conv 3×3, 512→512, **BN**, ReLU; MaxPool (2,2) stride (2,1) pad (0,1)</w:t>
+            </w:r>
+          </w:p>
+        </w:tc>
+        <w:tc>
+          <w:tcPr>
+            <w:tcW w:type="dxa" w:w="2880"/>
+          </w:tcPr>
+          <w:p>
+            <w:r>
+              <w:t>H/16, W/4</w:t>
+            </w:r>
+          </w:p>
+        </w:tc>
+      </w:tr>
+      <w:tr>
+        <w:tc>
+          <w:tcPr>
+            <w:tcW w:type="dxa" w:w="2880"/>
+          </w:tcPr>
+          <w:p>
+            <w:r>
+              <w:t>5</w:t>
+            </w:r>
+          </w:p>
+        </w:tc>
+        <w:tc>
+          <w:tcPr>
+            <w:tcW w:type="dxa" w:w="2880"/>
+          </w:tcPr>
+          <w:p>
+            <w:r>
+              <w:t>Conv 2×2, 512→512, **BN**, ReLU (stride 1, pad 0)</w:t>
+            </w:r>
+          </w:p>
+        </w:tc>
+        <w:tc>
+          <w:tcPr>
+            <w:tcW w:type="dxa" w:w="2880"/>
+          </w:tcPr>
+          <w:p>
+            <w:r>
+              <w:t>height collapses further</w:t>
+            </w:r>
+          </w:p>
+        </w:tc>
+      </w:tr>
+    </w:tbl>
+    <w:p/>
+    <w:p>
+      <w:r>
+        <w:t>`conv_bn(..., bn=False)` is Conv+ReLU only. BatchNorm appears only on the</w:t>
+      </w:r>
+    </w:p>
+    <w:p>
+      <w:r>
+        <w:t>512-channel blocks and the final 2×2 convolution.</w:t>
+      </w:r>
+    </w:p>
+    <w:p>
+      <w:r/>
+      <w:r>
+        <w:rPr>
+          <w:b/>
+        </w:rPr>
+        <w:t>Map-to-sequence.</w:t>
+      </w:r>
+      <w:r>
+        <w:t xml:space="preserve"> Squeeze height, then `permute(2, 0, 1)`:</w:t>
+      </w:r>
+    </w:p>
+    <w:p>
+      <w:r>
+        <w:t>`(B, C', W') → (T, B, C')` with \(T=W'\).</w:t>
+      </w:r>
+    </w:p>
+    <w:p>
+      <w:r/>
+      <w:r>
+        <w:rPr>
+          <w:b/>
+        </w:rPr>
+        <w:t>Recurrent head.</w:t>
+      </w:r>
+      <w:r>
+        <w:t xml:space="preserve"> Two stacked `BidirectionalLSTM` modules:</w:t>
+      </w:r>
+    </w:p>
+    <w:p>
+      <w:pPr>
+        <w:pStyle w:val="ListNumber"/>
+      </w:pPr>
+      <w:r>
+        <w:t>`nn.LSTM(512, 256, num_layers=2, bidirectional=True, dropout=0.1)` +</w:t>
+      </w:r>
+    </w:p>
+    <w:p>
+      <w:r>
+        <w:t>`Linear(512, 256)`. Config `rnn_layers: 2` is this first block’s layer count.</w:t>
+      </w:r>
+    </w:p>
+    <w:p>
+      <w:pPr>
+        <w:pStyle w:val="ListNumber"/>
+      </w:pPr>
+      <w:r>
+        <w:t>`nn.LSTM(256, 256, num_layers=1, bidirectional=True)` +</w:t>
+      </w:r>
+    </w:p>
+    <w:p>
+      <w:r>
+        <w:t>`Linear(512, num_classes)`.</w:t>
       </w:r>
     </w:p>
     <w:tbl>
@@ -1626,7 +2375,7 @@
           </w:tcPr>
           <w:p>
             <w:r>
-              <w:t>0.1</w:t>
+              <w:t>0.1 (only inside the first LSTM, because `num_layers&gt;1`)</w:t>
             </w:r>
           </w:p>
         </w:tc>
@@ -1675,6 +2424,50 @@
           </w:p>
         </w:tc>
       </w:tr>
+      <w:tr>
+        <w:tc>
+          <w:tcPr>
+            <w:tcW w:type="dxa" w:w="4320"/>
+          </w:tcPr>
+          <w:p>
+            <w:r>
+              <w:t>Parameters</w:t>
+            </w:r>
+          </w:p>
+        </w:tc>
+        <w:tc>
+          <w:tcPr>
+            <w:tcW w:type="dxa" w:w="4320"/>
+          </w:tcPr>
+          <w:p>
+            <w:r>
+              <w:t>**10,005,217** (`sum(p.numel())` on `build_crnn(225, local.yaml model)`)</w:t>
+            </w:r>
+          </w:p>
+        </w:tc>
+      </w:tr>
+      <w:tr>
+        <w:tc>
+          <w:tcPr>
+            <w:tcW w:type="dxa" w:w="4320"/>
+          </w:tcPr>
+          <w:p>
+            <w:r>
+              <w:t>I/O</w:t>
+            </w:r>
+          </w:p>
+        </w:tc>
+        <w:tc>
+          <w:tcPr>
+            <w:tcW w:type="dxa" w:w="4320"/>
+          </w:tcPr>
+          <w:p>
+            <w:r>
+              <w:t>input `(B, 1, 48, W)` → output `(T, B, 225)`</w:t>
+            </w:r>
+          </w:p>
+        </w:tc>
+      </w:tr>
     </w:tbl>
     <w:p/>
     <w:p>
@@ -1731,7 +2524,17 @@
     </w:p>
     <w:p>
       <w:r>
-        <w:t>(after removing blanks and repeats) to the Unicode transcript.</w:t>
+        <w:t>(after removing blanks and repeats) to the Unicode transcript. Greedy decode</w:t>
+      </w:r>
+    </w:p>
+    <w:p>
+      <w:r>
+        <w:t>(`Charset.ctc_greedy_decode`) drops blanks and merges repeats; `beam_lm` is</w:t>
+      </w:r>
+    </w:p>
+    <w:p>
+      <w:r>
+        <w:t>the delivered inference path (Section 6).</w:t>
       </w:r>
     </w:p>
     <w:p/>
@@ -1791,7 +2594,194 @@
         <w:pStyle w:val="Heading2"/>
       </w:pPr>
       <w:r>
-        <w:t>5.1 Chronology (from logs on disk + README where a log is empty)</w:t>
+        <w:t>5.1 Training algorithm (`src/recognition/train.py`)</w:t>
+      </w:r>
+    </w:p>
+    <w:p>
+      <w:r>
+        <w:rPr>
+          <w:rFonts w:ascii="Consolas" w:hAnsi="Consolas"/>
+          <w:sz w:val="18"/>
+        </w:rPr>
+        <w:t>load charset; model ← build_crnn(num_classes, model_cfg)</w:t>
+        <w:br/>
+        <w:t>criterion ← nn.CTCLoss(blank=0, zero_infinity=True)</w:t>
+        <w:br/>
+        <w:t>optimizer ← Adam(lr from config); scheduler ← ReduceLROnPlateau on val CER</w:t>
+        <w:br/>
+        <w:t>train_loader ← synthetic train (capped at synthetic_train_max)</w:t>
+        <w:br/>
+        <w:t xml:space="preserve">                ∪ extra-label files (repeat = extra_label_repeat)</w:t>
+        <w:br/>
+        <w:t>val_loader   ← synthetic val_labels.txt   # greedy CER, not the real holdout</w:t>
+        <w:br/>
+        <w:t>if resume: load weights; best_cer ← checkpoint CER (else +∞)</w:t>
+        <w:br/>
+        <w:br/>
+        <w:t>for epoch = 1 .. E:</w:t>
+        <w:br/>
+        <w:t xml:space="preserve">    # train_one_epoch</w:t>
+        <w:br/>
+        <w:t xml:space="preserve">    for images, targets, target_lengths, widths, texts in train_loader:</w:t>
+        <w:br/>
+        <w:t xml:space="preserve">        log_probs ← model(images)              # (T, B, C)</w:t>
+        <w:br/>
+        <w:t xml:space="preserve">        input_lengths ← T for every item</w:t>
+        <w:br/>
+        <w:t xml:space="preserve">        loss ← criterion(log_probs, targets, input_lengths, target_lengths)</w:t>
+        <w:br/>
+        <w:t xml:space="preserve">        clip_grad_norm_(max_norm=grad_clip); optimizer.step()</w:t>
+        <w:br/>
+        <w:t xml:space="preserve">    val_cer, val_wer ← evaluate_model(val_loader)   # greedy decode</w:t>
+        <w:br/>
+        <w:t xml:space="preserve">    save crnn_last.pth</w:t>
+        <w:br/>
+        <w:t xml:space="preserve">    if val_cer &lt; best_cer:</w:t>
+        <w:br/>
+        <w:t xml:space="preserve">        best_cer ← val_cer; save crnn_best.pth</w:t>
+        <w:br/>
+        <w:t xml:space="preserve">    else if patience exceeded: early stop</w:t>
+        <w:br/>
+        <w:t xml:space="preserve">    scheduler.step(val_cer)</w:t>
+      </w:r>
+    </w:p>
+    <w:p>
+      <w:r/>
+      <w:r>
+        <w:rPr>
+          <w:b/>
+        </w:rPr>
+        <w:t>Collate.</w:t>
+      </w:r>
+      <w:r>
+        <w:t xml:space="preserve"> `_ctc_collate_batch` right-pads images in a batch to the maximum</w:t>
+      </w:r>
+    </w:p>
+    <w:p>
+      <w:r>
+        <w:t xml:space="preserve">width with pad value </w:t>
+      </w:r>
+      <w:r>
+        <w:rPr>
+          <w:b/>
+        </w:rPr>
+        <w:t>1.0</w:t>
+      </w:r>
+      <w:r>
+        <w:t xml:space="preserve"> (normalised white). Targets are concatenated;</w:t>
+      </w:r>
+    </w:p>
+    <w:p>
+      <w:r>
+        <w:t>`target_lengths` are passed to CTC.</w:t>
+      </w:r>
+    </w:p>
+    <w:p>
+      <w:r/>
+      <w:r>
+        <w:rPr>
+          <w:b/>
+        </w:rPr>
+        <w:t>Extra-labels.</w:t>
+      </w:r>
+      <w:r>
+        <w:t xml:space="preserve"> `_merge_label_records` appends each `--extra-labels` file</w:t>
+      </w:r>
+    </w:p>
+    <w:p>
+      <w:r>
+        <w:t>after a seed-shuffled cap of the primary synthetic train (`synthetic_train_max`,</w:t>
+      </w:r>
+    </w:p>
+    <w:p>
+      <w:r>
+        <w:t>seed 1337). Files under `data/real/` resolve images from `real_dir`; generator</w:t>
+      </w:r>
+    </w:p>
+    <w:p>
+      <w:r>
+        <w:t>trees resolve from their own directory. That is how page-synth, hard, tiny,</w:t>
+      </w:r>
+    </w:p>
+    <w:p>
+      <w:r>
+        <w:t>poem-aug, user-aug, web-aug and Acts rows share a batch with synthetic lines.</w:t>
+      </w:r>
+    </w:p>
+    <w:p>
+      <w:r/>
+      <w:r>
+        <w:rPr>
+          <w:b/>
+        </w:rPr>
+        <w:t>CLI that produced the delivered `crnn_best.pth`</w:t>
+      </w:r>
+      <w:r>
+        <w:t xml:space="preserve"> (`configs/mix_jul28.yaml`):</w:t>
+      </w:r>
+    </w:p>
+    <w:p>
+      <w:r>
+        <w:rPr>
+          <w:rFonts w:ascii="Consolas" w:hAnsi="Consolas"/>
+          <w:sz w:val="18"/>
+        </w:rPr>
+        <w:t>python -m src.recognition.train --config configs/mix_jul28.yaml `</w:t>
+        <w:br/>
+        <w:t xml:space="preserve">    --extra-labels data/synthetic_pages/train_labels.txt `</w:t>
+        <w:br/>
+        <w:t xml:space="preserve">    --extra-labels data/synthetic_hard/train_labels.txt `</w:t>
+        <w:br/>
+        <w:t xml:space="preserve">    --extra-labels data/synthetic_small/train_labels.txt `</w:t>
+        <w:br/>
+        <w:t xml:space="preserve">    --extra-labels data/real/labels/poem_kanyawee_aug.txt `</w:t>
+        <w:br/>
+        <w:t xml:space="preserve">    --extra-labels data/real/labels/user_batch1_aug.txt `</w:t>
+        <w:br/>
+        <w:t xml:space="preserve">    --extra-labels data/real/labels/web_batch1_aug.txt `</w:t>
+        <w:br/>
+        <w:t xml:space="preserve">    --extra-labels data/real/labels/web_batch1_acts_aug.txt `</w:t>
+        <w:br/>
+        <w:t xml:space="preserve">    --extra-labels data/real/labels/web_batch1_acts.txt `</w:t>
+        <w:br/>
+        <w:t xml:space="preserve">    --resume models/crnn_best.pth</w:t>
+      </w:r>
+    </w:p>
+    <w:p>
+      <w:r>
+        <w:t xml:space="preserve">The trainer overwrites `crnn_best.pth` only when </w:t>
+      </w:r>
+      <w:r>
+        <w:rPr>
+          <w:b/>
+        </w:rPr>
+        <w:t>synthetic</w:t>
+      </w:r>
+      <w:r>
+        <w:t xml:space="preserve"> val CER</w:t>
+      </w:r>
+    </w:p>
+    <w:p>
+      <w:r>
+        <w:t>improves. Because a domain-mix run can trade synthetic CER for real accuracy,</w:t>
+      </w:r>
+    </w:p>
+    <w:p>
+      <w:r>
+        <w:t>the previous checkpoint is copied first (`models/crnn_best_pre_jul28.pth`) and</w:t>
+      </w:r>
+    </w:p>
+    <w:p>
+      <w:r>
+        <w:t>the keep/reject decision is made from the held-out suite.</w:t>
+      </w:r>
+    </w:p>
+    <w:p>
+      <w:pPr>
+        <w:pStyle w:val="Heading2"/>
+      </w:pPr>
+      <w:r>
+        <w:t>5.2 Chronology (from logs on disk + README where a log is empty)</w:t>
       </w:r>
     </w:p>
     <w:tbl>
@@ -2314,7 +3304,7 @@
         <w:pStyle w:val="Heading2"/>
       </w:pPr>
       <w:r>
-        <w:t>5.2 Hyperparameters of the delivered round</w:t>
+        <w:t>5.3 Hyperparameters of the delivered round</w:t>
       </w:r>
     </w:p>
     <w:p>
@@ -2606,6 +3596,26 @@
     <w:p/>
     <w:p>
       <w:r>
+        <w:t>`mix_web.yaml` (parent of this round) already set `lr: 8e-5`, `batch_size: 32`,</w:t>
+      </w:r>
+    </w:p>
+    <w:p>
+      <w:r>
+        <w:t>`extra_label_repeat: 1`, `synthetic_train_max: 10000`, `lr_patience: 2` and</w:t>
+      </w:r>
+    </w:p>
+    <w:p>
+      <w:r>
+        <w:t>`early_stopping_patience: 8`. `mix_jul28.yaml` only shortens the schedule</w:t>
+      </w:r>
+    </w:p>
+    <w:p>
+      <w:r>
+        <w:t>(epochs 12, early-stop patience 6) and adds the tiny-text extra-labels.</w:t>
+      </w:r>
+    </w:p>
+    <w:p>
+      <w:r>
         <w:t>The trainer writes `models/crnn_last.pth` every epoch and overwrites</w:t>
       </w:r>
     </w:p>
@@ -2643,7 +3653,7 @@
         <w:pStyle w:val="Heading2"/>
       </w:pPr>
       <w:r>
-        <w:t>5.3 Base (local.yaml) schedule used for from-scratch / v2–v3</w:t>
+        <w:t>5.4 Base (local.yaml) schedule used for from-scratch / v2–v3</w:t>
       </w:r>
     </w:p>
     <w:tbl>
@@ -2713,6 +3723,28 @@
           </w:tcPr>
           <w:p>
             <w:r>
+              <w:t>Optimiser</w:t>
+            </w:r>
+          </w:p>
+        </w:tc>
+        <w:tc>
+          <w:tcPr>
+            <w:tcW w:type="dxa" w:w="4320"/>
+          </w:tcPr>
+          <w:p>
+            <w:r>
+              <w:t>Adam (`weight_decay: 0`)</w:t>
+            </w:r>
+          </w:p>
+        </w:tc>
+      </w:tr>
+      <w:tr>
+        <w:tc>
+          <w:tcPr>
+            <w:tcW w:type="dxa" w:w="4320"/>
+          </w:tcPr>
+          <w:p>
+            <w:r>
               <w:t>LR</w:t>
             </w:r>
           </w:p>
@@ -2757,6 +3789,28 @@
           </w:tcPr>
           <w:p>
             <w:r>
+              <w:t>Gradient clip</w:t>
+            </w:r>
+          </w:p>
+        </w:tc>
+        <w:tc>
+          <w:tcPr>
+            <w:tcW w:type="dxa" w:w="4320"/>
+          </w:tcPr>
+          <w:p>
+            <w:r>
+              <w:t>5.0</w:t>
+            </w:r>
+          </w:p>
+        </w:tc>
+      </w:tr>
+      <w:tr>
+        <w:tc>
+          <w:tcPr>
+            <w:tcW w:type="dxa" w:w="4320"/>
+          </w:tcPr>
+          <w:p>
+            <w:r>
               <w:t>Save-best metric</w:t>
             </w:r>
           </w:p>
@@ -2767,7 +3821,7 @@
           </w:tcPr>
           <w:p>
             <w:r>
-              <w:t>CER</w:t>
+              <w:t>CER (`train.save_best_metric`)</w:t>
             </w:r>
           </w:p>
         </w:tc>

</xml_diff>